<commit_message>
feat: texto de Contexto operacional por empresa no Word da DF
- Empresa ganha contexto_operacional (+ auditoria de quem/quando editou)
- Tela da DF: botão e modal "Contexto operacional" (salva via AJAX,
  restrito a MASTER/ADMIN da empresa e global admin)
- Word: seção Contexto operacional passa a ser renderizada a partir do
  texto da empresa (parágrafos separados por linha em branco), com
  marcador visível quando não preenchido
- gerar_docx usa autoescape=True para texto livre não corromper o .docx
- Barra de ações da DF reorganizada (desktop em uma linha, mobile empilhado)
- Campo exposto no admin e variável documentada em variaveis_docx.md

Co-Authored-By: Claude Sonnet 5.5 <noreply@anthropic.com>
</commit_message>
<xml_diff>
--- a/media/doc/modelo_df.docx
+++ b/media/doc/modelo_df.docx
@@ -135,17 +135,32 @@
         <w:jc w:val="both"/>
       </w:pPr>
       <w:r>
-        <w:t>XXXXXXXX</w:t>
-      </w:r>
-    </w:p>
-    <w:p>
-      <w:pPr>
-        <w:pStyle w:val="Corpodetexto"/>
-        <w:jc w:val="both"/>
-        <w:rPr>
-          <w:lang w:val="pt-BR"/>
-        </w:rPr>
-      </w:pPr>
+        <w:t xml:space="preserve">{%p for par in contexto_operacional_paragrafos %}</w:t>
+      </w:r>
+    </w:p>
+    <w:p>
+      <w:pPr>
+        <w:pStyle w:val="Corpodetexto"/>
+        <w:jc w:val="both"/>
+      </w:pPr>
+      <w:r>
+        <w:t xml:space="preserve">{{ par }}</w:t>
+      </w:r>
+    </w:p>
+    <w:p>
+      <w:pPr>
+        <w:pStyle w:val="Corpodetexto"/>
+        <w:jc w:val="both"/>
+      </w:pPr>
+    </w:p>
+    <w:p>
+      <w:pPr>
+        <w:pStyle w:val="Corpodetexto"/>
+        <w:jc w:val="both"/>
+      </w:pPr>
+      <w:r>
+        <w:t xml:space="preserve">{%p endfor %}</w:t>
+      </w:r>
     </w:p>
     <w:p>
       <w:pPr>

</xml_diff>